<commit_message>
Revert guide to original content: restore all removed items
Reverted 11 items back to old version:
- thinky mode to feely mode (was analytical/emotional)
- Numbered format (1)(2)(3) for Karpathy loop
- nano ~/.mempalace/identity.txt command
- First-person identity quote (I am Hassan...)
- Nemotron pull comment (# exact Nemotron 3 Nano name)
- ollama run test commands
- Appendix reference (section 1.3)
- Google AI Studio key config mention (3.2)
- Playwright notebooklm-podcast-automator fallback
- pip install hermes-agent[feishu] exact command
- Appendix B title to API Keys
- notebooklm-podcast-automator in resource links
</commit_message>
<xml_diff>
--- a/Kerapathys_Local_Build_Guide.docx
+++ b/Kerapathys_Local_Build_Guide.docx
@@ -3268,7 +3268,8 @@
           <w:sz w:val="20"/>
           <w:szCs w:val="20"/>
         </w:rPr>
-        <w:t xml:space="preserve">ollama pull nemotron-mini:4b</w:t>
+        <w:t>ollama pull nemotron-mini:4b  # or the exact Nemotron 3 Nano name</w:t>
+        <w:br/>
       </w:r>
     </w:p>
     <w:p>
@@ -3283,7 +3284,22 @@
           <w:sz w:val="24"/>
           <w:szCs w:val="24"/>
         </w:rPr>
-        <w:t xml:space="preserve">Test both models to confirm they work correctly. Then make sure Ollama starts automatically on boot:</w:t>
+        <w:t>Test both models to confirm they work correctly:</w:t>
+      </w:r>
+    </w:p>
+    <w:p>
+      <w:r>
+        <w:t>Then make sure Ollama starts automatically on boot:</w:t>
+      </w:r>
+    </w:p>
+    <w:p>
+      <w:r>
+        <w:t>ollama run nemotron-mini:4b "Say hello in one sentence"</w:t>
+      </w:r>
+    </w:p>
+    <w:p>
+      <w:r>
+        <w:t>ollama run gemma4:e4 "Say hello in one sentence"</w:t>
       </w:r>
     </w:p>
     <w:p>
@@ -3752,7 +3768,13 @@
           <w:sz w:val="24"/>
           <w:szCs w:val="24"/>
         </w:rPr>
-        <w:t xml:space="preserve">This creates the .mempalace directory with your identity, wing config, and palace structure. Edit the identity file to tell the AI who you are. For example: write that you are a documentary scriptwriter based in Pakistan, making Johnny Harris-style videos about technology, economy, and society, using Hermes Agent with local models and free cloud providers.</w:t>
+        <w:t>This creates the .mempalace directory with your identity, wing config, and palace structure. Edit the identity file to tell the AI who you are:</w:t>
+        <w:br/>
+        <w:br/>
+        <w:t>nano ~/.mempalace/identity.txt</w:t>
+        <w:br/>
+        <w:br/>
+        <w:t>"I am Hassan, a documentary scriptwriter based in Pakistan, making Johnny Harris-style videos about technology, economy, and society, using Hermes Agent with local models and free cloud providers."</w:t>
       </w:r>
     </w:p>
     <w:p>
@@ -4091,7 +4113,7 @@
           <w:sz w:val="24"/>
           <w:szCs w:val="24"/>
         </w:rPr>
-        <w:t xml:space="preserve">This is the instruction file that tells Hermes what to do when it enters the research stage. Create ~/kerapathys/stages/01-research/CONTEXT.md. The key sections are: Inputs (what the stage receives, typically a topic string), Process (step-by-step instructions following the deer-flow methodology), and Outputs (what the stage produces, typically a research-dossier.md file). The process should follow the 6-phase deer-flow pipeline with specific prompts for each phase.</w:t>
+        <w:t>This is the instruction file that tells Hermes what to do when it enters the research stage. Create ~/kerapathys/stages/01-research/CONTEXT.md. The key sections are: Inputs (what the stage receives, typically a topic string), Process (step-by-step instructions following the deer-flow methodology), and Outputs (what the stage produces, typically a research-dossier.md file). The process should follow the 6-phase deer-flow pipeline with specific prompts for each phase. See the appendix for the full CONTEXT.md content (section 1.3).</w:t>
       </w:r>
     </w:p>
     <w:p>
@@ -5161,7 +5183,7 @@
           <w:sz w:val="24"/>
           <w:szCs w:val="24"/>
         </w:rPr>
-        <w:t xml:space="preserve">The Anchor-Bridge Formula is the core structural pattern: drop the viewer into something REAL (an object, a document, a person), THEN explain. Context never precedes evidence. The script structure follows: Hook (in medias res), then Anchor (tangible visual), then Bridge (mechanism), then Reveal (challenges assumption), then Conclusion (shift to personal/poetic mode). The last 10-20% of the script must shift from analytical mode to emotional mode.</w:t>
+        <w:t>The Anchor-Bridge Formula is the core structural pattern: drop the viewer into something REAL (an object, a document, a person), THEN explain. Context never precedes evidence. The script structure follows: Hook (in medias res), then Anchor (tangible visual), then Bridge (mechanism), then Reveal (challenges assumption), then Conclusion (shift to personal/poetic mode). The last 10-20% of the script must shift from thinky mode to feely mode.</w:t>
       </w:r>
     </w:p>
     <w:p>
@@ -5195,7 +5217,18 @@
           <w:sz w:val="24"/>
           <w:szCs w:val="24"/>
         </w:rPr>
-        <w:t xml:space="preserve">Named after Andrej Karpathy's iterative improvement philosophy, this is the core quality mechanism. The loop works as follows: First, write a draft script using the research dossier. Second, score the draft against a 56-question checklist across 9 categories. Third, if the score is below 85%, the mutator identifies weak sections and rewrites only those sections (keeping strong sections exactly as-is). Fourth, re-score the improved draft. Fifth, repeat up to 20 iterations.</w:t>
+        <w:t>Named after Andrej Karpathy's iterative improvement philosophy, this is the core quality mechanism. The loop works as follows:</w:t>
+        <w:br/>
+        <w:br/>
+        <w:t>(1) Write a draft script using the research dossier.</w:t>
+        <w:br/>
+        <w:t>(2) Score the draft against a 56-question checklist across 9 categories.</w:t>
+        <w:br/>
+        <w:t>(3) If the score is below 85%, the mutator identifies weak sections and rewrites only those sections (keeping strong sections exactly as-is).</w:t>
+        <w:br/>
+        <w:t>(4) Re-score the improved draft.</w:t>
+        <w:br/>
+        <w:t>(5) Repeat up to 20 iterations.</w:t>
       </w:r>
     </w:p>
     <w:p>
@@ -5376,7 +5409,7 @@
           <w:sz w:val="24"/>
           <w:szCs w:val="24"/>
         </w:rPr>
-        <w:t xml:space="preserve">To set up OpenMAIC, install Node.js 22+, clone the repository, run pnpm install and pnpm dev. It runs on localhost:3000. You need at least one LLM API key (Google Gemini Flash is recommended as the default). OpenMAIC has NO GPU requirements since all AI calls go to external cloud APIs. For your 16GB machine, this is perfect since the application itself is lightweight.</w:t>
+        <w:t>To set up OpenMAIC, install Node.js 22+, clone the repository, run pnpm install and pnpm dev. It runs on localhost:3000. You need at least one LLM API key (Google Gemini Flash is recommended as the default). OpenMAIC has NO GPU requirements since all AI calls go to external cloud APIs. For your 16GB machine, this is perfect since the application itself is lightweight. Configure it to use your Google AI Studio key for generation.</w:t>
       </w:r>
     </w:p>
     <w:p>
@@ -5497,7 +5530,7 @@
           <w:sz w:val="24"/>
           <w:szCs w:val="24"/>
         </w:rPr>
-        <w:t xml:space="preserve">For a more immersive review experience, you can send your script to Google NotebookLM to generate an audio overview. This lets you listen to your script as a podcast-style discussion, which is invaluable for catching awkward phrasing, pacing issues, and unclear sections. Install the notebooklm-py library and authenticate with your Google account. The basic workflow: create a notebook, add your script as a text source, generate an audio overview with custom instructions, download the MP3, listen and note improvements, then send feedback via WhatsApp or Lark.</w:t>
+        <w:t>For a more immersive review experience, you can send your script to Google NotebookLM to generate an audio overview. This lets you listen to your script as a podcast-style discussion, which is invaluable for catching awkward phrasing, pacing issues, and unclear sections. Install the notebooklm-py library and authenticate with your Google account. The basic workflow: create a notebook, add your script as a text source, generate an audio overview with custom instructions, download the MP3, listen and note improvements, then send feedback via WhatsApp or Lark. Note: notebooklm-py uses undocumented Google APIs which may break at any time. As a fallback, consider the Playwright-based notebooklm-podcast-automator package.</w:t>
       </w:r>
     </w:p>
     <w:p>
@@ -5974,7 +6007,13 @@
           <w:sz w:val="24"/>
           <w:szCs w:val="24"/>
         </w:rPr>
-        <w:t xml:space="preserve">Lark integration requires a Feishu/Lark developer account. Go to open.feishu.cn and create an application. Copy the App ID and App Secret, add them to your Hermes environment file, install the Feishu extra, and run the gateway setup. Lark supports voice, images, files, threads, reactions, and typing indicators, providing more features than WhatsApp. Use FEISHU_DOMAIN=lark for international version or feishu for China version.</w:t>
+        <w:t>Lark integration requires a Feishu/Lark developer account. Go to open.feishu.cn and create an application. Copy the App ID and App Secret, add them to your Hermes environment file. Install the Feishu extra:</w:t>
+        <w:br/>
+        <w:br/>
+        <w:t>pip install 'hermes-agent[feishu]'</w:t>
+        <w:br/>
+        <w:br/>
+        <w:t>Then run the gateway setup. Lark supports voice, images, files, threads, reactions, and typing indicators, providing more features than WhatsApp. Use FEISHU_DOMAIN=lark for international version or feishu for China version.</w:t>
       </w:r>
     </w:p>
     <w:p>
@@ -7273,7 +7312,7 @@
           <w:sz w:val="28"/>
           <w:szCs w:val="28"/>
         </w:rPr>
-        <w:t xml:space="preserve">B.1 Environment Variables (~/.hermes/.env)</w:t>
+        <w:t>B.1 API Keys (~/.hermes/.env)</w:t>
       </w:r>
       <w:bookmarkEnd w:id="100044"/>
     </w:p>
@@ -10442,6 +10481,38 @@
                 <w:szCs w:val="21"/>
               </w:rPr>
               <w:t xml:space="preserve">Previous system reference</w:t>
+            </w:r>
+          </w:p>
+        </w:tc>
+      </w:tr>
+      <w:tr>
+        <w:tc>
+          <w:tcPr>
+            <w:tcW w:type="dxa" w:w="100"/>
+          </w:tcPr>
+          <w:p>
+            <w:r>
+              <w:t>notebooklm-podcast-automator</w:t>
+            </w:r>
+          </w:p>
+        </w:tc>
+        <w:tc>
+          <w:tcPr>
+            <w:tcW w:type="dxa" w:w="100"/>
+          </w:tcPr>
+          <w:p>
+            <w:r>
+              <w:t>github.com/jjk59/notebooklm-podcast-automator</w:t>
+            </w:r>
+          </w:p>
+        </w:tc>
+        <w:tc>
+          <w:tcPr>
+            <w:tcW w:type="dxa" w:w="100"/>
+          </w:tcPr>
+          <w:p>
+            <w:r>
+              <w:t>Playwright-based NotebookLM fallback</w:t>
             </w:r>
           </w:p>
         </w:tc>

</xml_diff>